<commit_message>
Materialliste + Google indexierung
</commit_message>
<xml_diff>
--- a/extras/Laufzettel_Bueze_mit_Nummer.docx
+++ b/extras/Laufzettel_Bueze_mit_Nummer.docx
@@ -111,7 +111,7 @@
                 <w:sz w:val="28"/>
                 <w:szCs w:val="28"/>
               </w:rPr>
-              <w:t>9</w:t>
+              <w:t>7</w:t>
             </w:r>
             <w:r>
               <w:rPr>
@@ -129,16 +129,7 @@
                 <w:sz w:val="28"/>
                 <w:szCs w:val="28"/>
               </w:rPr>
-              <w:t>0</w:t>
-            </w:r>
-            <w:r>
-              <w:rPr>
-                <w:b/>
-                <w:bCs/>
-                <w:sz w:val="28"/>
-                <w:szCs w:val="28"/>
-              </w:rPr>
-              <w:t>9</w:t>
+              <w:t>10</w:t>
             </w:r>
             <w:r>
               <w:rPr>

</xml_diff>